<commit_message>
style(cv): update Ussus template layout, sizing, and brand footer
</commit_message>
<xml_diff>
--- a/server/templates/CV Ussus.docx
+++ b/server/templates/CV Ussus.docx
@@ -2,32 +2,585 @@
 <file path=word/document.xml><?xml version="1.0" encoding="utf-8"?>
 <w:document xmlns:wpc="http://schemas.microsoft.com/office/word/2010/wordprocessingCanvas" xmlns:mc="http://schemas.openxmlformats.org/markup-compatibility/2006" xmlns:o="urn:schemas-microsoft-com:office:office" xmlns:r="http://schemas.openxmlformats.org/officeDocument/2006/relationships" xmlns:m="http://schemas.openxmlformats.org/officeDocument/2006/math" xmlns:v="urn:schemas-microsoft-com:vml" xmlns:wp14="http://schemas.microsoft.com/office/word/2010/wordprocessingDrawing" xmlns:wp="http://schemas.openxmlformats.org/drawingml/2006/wordprocessingDrawing" xmlns:w10="urn:schemas-microsoft-com:office:word" xmlns:w="http://schemas.openxmlformats.org/wordprocessingml/2006/main" xmlns:w14="http://schemas.microsoft.com/office/word/2010/wordml" xmlns:w15="http://schemas.microsoft.com/office/word/2012/wordml" xmlns:wpg="http://schemas.microsoft.com/office/word/2010/wordprocessingGroup" xmlns:wpi="http://schemas.microsoft.com/office/word/2010/wordprocessingInk" xmlns:wne="http://schemas.microsoft.com/office/word/2006/wordml" xmlns:wps="http://schemas.microsoft.com/office/word/2010/wordprocessingShape" xmlns:cx="http://schemas.microsoft.com/office/drawing/2014/chartex" xmlns:cx1="http://schemas.microsoft.com/office/drawing/2015/9/8/chartex" xmlns:cx2="http://schemas.microsoft.com/office/drawing/2015/10/21/chartex" xmlns:cx3="http://schemas.microsoft.com/office/drawing/2016/5/9/chartex" xmlns:cx4="http://schemas.microsoft.com/office/drawing/2016/5/10/chartex" xmlns:cx5="http://schemas.microsoft.com/office/drawing/2016/5/11/chartex" xmlns:cx6="http://schemas.microsoft.com/office/drawing/2016/5/12/chartex" xmlns:cx7="http://schemas.microsoft.com/office/drawing/2016/5/13/chartex" xmlns:cx8="http://schemas.microsoft.com/office/drawing/2016/5/14/chartex" xmlns:aink="http://schemas.microsoft.com/office/drawing/2016/ink" xmlns:am3d="http://schemas.microsoft.com/office/drawing/2017/model3d" xmlns:w16cex="http://schemas.microsoft.com/office/word/2018/wordml/cex" xmlns:w16cid="http://schemas.microsoft.com/office/word/2016/wordml/cid" xmlns:w16="http://schemas.microsoft.com/office/word/2018/wordml" xmlns:w16sdtdh="http://schemas.microsoft.com/office/word/2020/wordml/sdtdatahash" xmlns:w16se="http://schemas.microsoft.com/office/word/2015/wordml/symex" mc:Ignorable="w14 w15 wp14">
   <w:body>
+    <w:tbl>
+      <w:tblPr>
+        <w:tblW w:type="pct" w:w="100%"/>
+        <w:tblBorders>
+          <w:top w:val="none" w:color="auto" w:sz="0"/>
+          <w:left w:val="none" w:color="auto" w:sz="0"/>
+          <w:bottom w:val="none" w:color="auto" w:sz="0"/>
+          <w:right w:val="none" w:color="auto" w:sz="0"/>
+          <w:insideH w:val="single" w:color="auto" w:sz="4"/>
+          <w:insideV w:val="single" w:color="auto" w:sz="4"/>
+        </w:tblBorders>
+      </w:tblPr>
+      <w:tblGrid>
+        <w:gridCol w:w="100"/>
+        <w:gridCol w:w="100"/>
+      </w:tblGrid>
+      <w:tr>
+        <w:tc>
+          <w:tcPr>
+            <w:tcW w:type="pct" w:w="60%"/>
+            <w:tcBorders>
+              <w:top w:val="none" w:color="auto" w:sz="0"/>
+              <w:left w:val="none" w:color="auto" w:sz="0"/>
+              <w:bottom w:val="none" w:color="auto" w:sz="0"/>
+              <w:right w:val="none" w:color="auto" w:sz="0"/>
+            </w:tcBorders>
+            <w:vAlign w:val="center"/>
+          </w:tcPr>
+          <w:p>
+            <w:pPr>
+              <w:spacing w:after="180"/>
+            </w:pPr>
+            <w:r>
+              <w:rPr>
+                <w:rFonts w:ascii="Times New Roman" w:cs="Times New Roman" w:eastAsia="Times New Roman" w:hAnsi="Times New Roman"/>
+                <w:b/>
+                <w:bCs/>
+                <w:sz w:val="22"/>
+                <w:szCs w:val="22"/>
+              </w:rPr>
+              <w:t xml:space="preserve">NAME: </w:t>
+            </w:r>
+            <w:r>
+              <w:rPr>
+                <w:rFonts w:ascii="Times New Roman" w:cs="Times New Roman" w:eastAsia="Times New Roman" w:hAnsi="Times New Roman"/>
+                <w:b w:val="false"/>
+                <w:bCs w:val="false"/>
+                <w:sz w:val="22"/>
+                <w:szCs w:val="22"/>
+              </w:rPr>
+              <w:t xml:space="preserve">{fullName}</w:t>
+            </w:r>
+          </w:p>
+          <w:p>
+            <w:pPr>
+              <w:spacing w:after="180"/>
+            </w:pPr>
+            <w:r>
+              <w:rPr>
+                <w:rFonts w:ascii="Times New Roman" w:cs="Times New Roman" w:eastAsia="Times New Roman" w:hAnsi="Times New Roman"/>
+                <w:b/>
+                <w:bCs/>
+                <w:sz w:val="22"/>
+                <w:szCs w:val="22"/>
+              </w:rPr>
+              <w:t xml:space="preserve">AGE: </w:t>
+            </w:r>
+            <w:r>
+              <w:rPr>
+                <w:rFonts w:ascii="Times New Roman" w:cs="Times New Roman" w:eastAsia="Times New Roman" w:hAnsi="Times New Roman"/>
+                <w:b w:val="false"/>
+                <w:bCs w:val="false"/>
+                <w:sz w:val="22"/>
+                <w:szCs w:val="22"/>
+              </w:rPr>
+              <w:t xml:space="preserve">{age} YEARS</w:t>
+            </w:r>
+          </w:p>
+          <w:p>
+            <w:pPr>
+              <w:spacing w:after="180"/>
+            </w:pPr>
+            <w:r>
+              <w:rPr>
+                <w:rFonts w:ascii="Times New Roman" w:cs="Times New Roman" w:eastAsia="Times New Roman" w:hAnsi="Times New Roman"/>
+                <w:b/>
+                <w:bCs/>
+                <w:sz w:val="22"/>
+                <w:szCs w:val="22"/>
+              </w:rPr>
+              <w:t xml:space="preserve">NATIONALITY: </w:t>
+            </w:r>
+            <w:r>
+              <w:rPr>
+                <w:rFonts w:ascii="Times New Roman" w:cs="Times New Roman" w:eastAsia="Times New Roman" w:hAnsi="Times New Roman"/>
+                <w:b w:val="false"/>
+                <w:bCs w:val="false"/>
+                <w:sz w:val="22"/>
+                <w:szCs w:val="22"/>
+              </w:rPr>
+              <w:t xml:space="preserve">{nationality}</w:t>
+            </w:r>
+          </w:p>
+          <w:p>
+            <w:pPr>
+              <w:spacing w:after="180"/>
+            </w:pPr>
+            <w:r>
+              <w:rPr>
+                <w:rFonts w:ascii="Times New Roman" w:cs="Times New Roman" w:eastAsia="Times New Roman" w:hAnsi="Times New Roman"/>
+                <w:b/>
+                <w:bCs/>
+                <w:sz w:val="22"/>
+                <w:szCs w:val="22"/>
+              </w:rPr>
+              <w:t xml:space="preserve">RELIGION: </w:t>
+            </w:r>
+            <w:r>
+              <w:rPr>
+                <w:rFonts w:ascii="Times New Roman" w:cs="Times New Roman" w:eastAsia="Times New Roman" w:hAnsi="Times New Roman"/>
+                <w:b w:val="false"/>
+                <w:bCs w:val="false"/>
+                <w:sz w:val="22"/>
+                <w:szCs w:val="22"/>
+              </w:rPr>
+              <w:t xml:space="preserve">{religion}</w:t>
+            </w:r>
+          </w:p>
+          <w:p>
+            <w:pPr>
+              <w:spacing w:after="180"/>
+            </w:pPr>
+            <w:r>
+              <w:rPr>
+                <w:rFonts w:ascii="Times New Roman" w:cs="Times New Roman" w:eastAsia="Times New Roman" w:hAnsi="Times New Roman"/>
+                <w:b/>
+                <w:bCs/>
+                <w:sz w:val="22"/>
+                <w:szCs w:val="22"/>
+              </w:rPr>
+              <w:t xml:space="preserve">PASSPORT NUMBER: </w:t>
+            </w:r>
+            <w:r>
+              <w:rPr>
+                <w:rFonts w:ascii="Times New Roman" w:cs="Times New Roman" w:eastAsia="Times New Roman" w:hAnsi="Times New Roman"/>
+                <w:b w:val="false"/>
+                <w:bCs w:val="false"/>
+                <w:sz w:val="22"/>
+                <w:szCs w:val="22"/>
+              </w:rPr>
+              <w:t xml:space="preserve">{passportNumber}</w:t>
+            </w:r>
+          </w:p>
+        </w:tc>
+        <w:tc>
+          <w:tcPr>
+            <w:tcW w:type="pct" w:w="40%"/>
+            <w:tcBorders>
+              <w:top w:val="none" w:color="auto" w:sz="0"/>
+              <w:left w:val="none" w:color="auto" w:sz="0"/>
+              <w:bottom w:val="none" w:color="auto" w:sz="0"/>
+              <w:right w:val="none" w:color="auto" w:sz="0"/>
+            </w:tcBorders>
+            <w:tcMar>
+              <w:top w:type="dxa" w:w="0"/>
+              <w:left w:type="dxa" w:w="0"/>
+              <w:bottom w:type="dxa" w:w="0"/>
+              <w:right w:type="dxa" w:w="0"/>
+            </w:tcMar>
+            <w:vAlign w:val="center"/>
+          </w:tcPr>
+          <w:p>
+            <w:pPr>
+              <w:spacing w:after="0" w:before="0"/>
+              <w:jc w:val="center"/>
+            </w:pPr>
+            <w:r>
+              <w:t xml:space="preserve">{%facePhoto}</w:t>
+            </w:r>
+          </w:p>
+        </w:tc>
+      </w:tr>
+    </w:tbl>
     <w:p>
       <w:pPr>
-        <w:jc w:val="center"/>
-      </w:pPr>
-      <w:r>
-        <w:t xml:space="preserve">Ussus Template Placeholder
-Name: {fullName}
-Passport: {passportNumber}
-{%facePhoto}
-{%fullBodyPhoto}</w:t>
-      </w:r>
-      <w:r>
-        <w:br/>
-        <w:br/>
-        <w:t xml:space="preserve">
-Scan to watch video:
-</w:t>
-      </w:r>
-      <w:r>
-        <w:t xml:space="preserve">{%qrCode}</w:t>
-      </w:r>
+        <w:spacing w:after="100"/>
+      </w:pPr>
     </w:p>
+    <w:tbl>
+      <w:tblPr>
+        <w:tblW w:type="pct" w:w="100%"/>
+        <w:tblBorders>
+          <w:top w:val="none" w:color="auto" w:sz="0"/>
+          <w:left w:val="none" w:color="auto" w:sz="0"/>
+          <w:bottom w:val="none" w:color="auto" w:sz="0"/>
+          <w:right w:val="none" w:color="auto" w:sz="0"/>
+          <w:insideH w:val="single" w:color="auto" w:sz="4"/>
+          <w:insideV w:val="single" w:color="auto" w:sz="4"/>
+        </w:tblBorders>
+      </w:tblPr>
+      <w:tblGrid>
+        <w:gridCol w:w="100"/>
+        <w:gridCol w:w="100"/>
+      </w:tblGrid>
+      <w:tr>
+        <w:tc>
+          <w:tcPr>
+            <w:tcW w:type="pct" w:w="40%"/>
+            <w:tcBorders>
+              <w:top w:val="none" w:color="auto" w:sz="0"/>
+              <w:left w:val="none" w:color="auto" w:sz="0"/>
+              <w:bottom w:val="none" w:color="auto" w:sz="0"/>
+              <w:right w:val="none" w:color="auto" w:sz="0"/>
+            </w:tcBorders>
+            <w:tcMar>
+              <w:top w:type="dxa" w:w="0"/>
+              <w:left w:type="dxa" w:w="0"/>
+              <w:bottom w:type="dxa" w:w="0"/>
+              <w:right w:type="dxa" w:w="0"/>
+            </w:tcMar>
+            <w:vAlign w:val="center"/>
+          </w:tcPr>
+          <w:p>
+            <w:pPr>
+              <w:spacing w:after="0" w:before="0"/>
+              <w:jc w:val="center"/>
+            </w:pPr>
+            <w:r>
+              <w:t xml:space="preserve">{%fullBodyPhoto}</w:t>
+            </w:r>
+          </w:p>
+        </w:tc>
+        <w:tc>
+          <w:tcPr>
+            <w:tcW w:type="pct" w:w="60%"/>
+            <w:tcBorders>
+              <w:top w:val="none" w:color="auto" w:sz="0"/>
+              <w:left w:val="none" w:color="auto" w:sz="0"/>
+              <w:bottom w:val="none" w:color="auto" w:sz="0"/>
+              <w:right w:val="none" w:color="auto" w:sz="0"/>
+            </w:tcBorders>
+            <w:tcMar>
+              <w:left w:type="dxa" w:w="200"/>
+            </w:tcMar>
+            <w:vAlign w:val="top"/>
+          </w:tcPr>
+          <w:p>
+            <w:pPr>
+              <w:spacing w:after="180"/>
+            </w:pPr>
+            <w:r>
+              <w:rPr>
+                <w:rFonts w:ascii="Times New Roman" w:cs="Times New Roman" w:eastAsia="Times New Roman" w:hAnsi="Times New Roman"/>
+                <w:b/>
+                <w:bCs/>
+                <w:sz w:val="20"/>
+                <w:szCs w:val="20"/>
+              </w:rPr>
+              <w:t xml:space="preserve">LANGUAGE: </w:t>
+            </w:r>
+            <w:r>
+              <w:rPr>
+                <w:rFonts w:ascii="Times New Roman" w:cs="Times New Roman" w:eastAsia="Times New Roman" w:hAnsi="Times New Roman"/>
+                <w:b w:val="false"/>
+                <w:bCs w:val="false"/>
+                <w:sz w:val="20"/>
+                <w:szCs w:val="20"/>
+              </w:rPr>
+              <w:t xml:space="preserve">{languages}</w:t>
+            </w:r>
+          </w:p>
+          <w:p>
+            <w:pPr>
+              <w:spacing w:after="180"/>
+            </w:pPr>
+            <w:r>
+              <w:rPr>
+                <w:rFonts w:ascii="Times New Roman" w:cs="Times New Roman" w:eastAsia="Times New Roman" w:hAnsi="Times New Roman"/>
+                <w:b/>
+                <w:bCs/>
+                <w:sz w:val="20"/>
+                <w:szCs w:val="20"/>
+              </w:rPr>
+              <w:t xml:space="preserve">MONTHLY SALARY: </w:t>
+            </w:r>
+            <w:r>
+              <w:rPr>
+                <w:rFonts w:ascii="Times New Roman" w:cs="Times New Roman" w:eastAsia="Times New Roman" w:hAnsi="Times New Roman"/>
+                <w:b/>
+                <w:bCs/>
+                <w:sz w:val="20"/>
+                <w:szCs w:val="20"/>
+              </w:rPr>
+              <w:t xml:space="preserve">{salary}</w:t>
+            </w:r>
+          </w:p>
+          <w:p>
+            <w:pPr>
+              <w:spacing w:after="180"/>
+            </w:pPr>
+            <w:r>
+              <w:rPr>
+                <w:rFonts w:ascii="Times New Roman" w:cs="Times New Roman" w:eastAsia="Times New Roman" w:hAnsi="Times New Roman"/>
+                <w:b/>
+                <w:bCs/>
+                <w:sz w:val="20"/>
+                <w:szCs w:val="20"/>
+              </w:rPr>
+              <w:t xml:space="preserve">PHONE NUMBER: </w:t>
+            </w:r>
+            <w:r>
+              <w:rPr>
+                <w:rFonts w:ascii="Times New Roman" w:cs="Times New Roman" w:eastAsia="Times New Roman" w:hAnsi="Times New Roman"/>
+                <w:b/>
+                <w:bCs/>
+                <w:sz w:val="20"/>
+                <w:szCs w:val="20"/>
+              </w:rPr>
+              <w:t xml:space="preserve">{phone}</w:t>
+            </w:r>
+          </w:p>
+          <w:p>
+            <w:pPr>
+              <w:spacing w:after="180"/>
+            </w:pPr>
+            <w:r>
+              <w:rPr>
+                <w:rFonts w:ascii="Times New Roman" w:cs="Times New Roman" w:eastAsia="Times New Roman" w:hAnsi="Times New Roman"/>
+                <w:b/>
+                <w:bCs/>
+                <w:sz w:val="20"/>
+                <w:szCs w:val="20"/>
+              </w:rPr>
+              <w:t xml:space="preserve">MARITAL STATUS: </w:t>
+            </w:r>
+            <w:r>
+              <w:rPr>
+                <w:rFonts w:ascii="Times New Roman" w:cs="Times New Roman" w:eastAsia="Times New Roman" w:hAnsi="Times New Roman"/>
+                <w:b w:val="false"/>
+                <w:bCs w:val="false"/>
+                <w:sz w:val="20"/>
+                <w:szCs w:val="20"/>
+              </w:rPr>
+              <w:t xml:space="preserve">{maritalStatus}</w:t>
+            </w:r>
+          </w:p>
+          <w:p>
+            <w:pPr>
+              <w:spacing w:after="180"/>
+            </w:pPr>
+            <w:r>
+              <w:rPr>
+                <w:rFonts w:ascii="Times New Roman" w:cs="Times New Roman" w:eastAsia="Times New Roman" w:hAnsi="Times New Roman"/>
+                <w:b/>
+                <w:bCs/>
+                <w:sz w:val="20"/>
+                <w:szCs w:val="20"/>
+              </w:rPr>
+              <w:t xml:space="preserve">NUMBER OF KIDS: </w:t>
+            </w:r>
+            <w:r>
+              <w:rPr>
+                <w:rFonts w:ascii="Times New Roman" w:cs="Times New Roman" w:eastAsia="Times New Roman" w:hAnsi="Times New Roman"/>
+                <w:b w:val="false"/>
+                <w:bCs w:val="false"/>
+                <w:sz w:val="20"/>
+                <w:szCs w:val="20"/>
+              </w:rPr>
+              <w:t xml:space="preserve">{numberOfChildren} KIDS</w:t>
+            </w:r>
+          </w:p>
+          <w:p>
+            <w:pPr>
+              <w:spacing w:after="180"/>
+            </w:pPr>
+            <w:r>
+              <w:rPr>
+                <w:rFonts w:ascii="Times New Roman" w:cs="Times New Roman" w:eastAsia="Times New Roman" w:hAnsi="Times New Roman"/>
+                <w:b/>
+                <w:bCs/>
+                <w:sz w:val="20"/>
+                <w:szCs w:val="20"/>
+              </w:rPr>
+              <w:t xml:space="preserve">HEIGHT: </w:t>
+            </w:r>
+            <w:r>
+              <w:rPr>
+                <w:rFonts w:ascii="Times New Roman" w:cs="Times New Roman" w:eastAsia="Times New Roman" w:hAnsi="Times New Roman"/>
+                <w:b w:val="false"/>
+                <w:bCs w:val="false"/>
+                <w:sz w:val="20"/>
+                <w:szCs w:val="20"/>
+              </w:rPr>
+              <w:t xml:space="preserve">{height}</w:t>
+            </w:r>
+          </w:p>
+          <w:p>
+            <w:pPr>
+              <w:spacing w:after="180"/>
+            </w:pPr>
+            <w:r>
+              <w:rPr>
+                <w:rFonts w:ascii="Times New Roman" w:cs="Times New Roman" w:eastAsia="Times New Roman" w:hAnsi="Times New Roman"/>
+                <w:b/>
+                <w:bCs/>
+                <w:sz w:val="20"/>
+                <w:szCs w:val="20"/>
+              </w:rPr>
+              <w:t xml:space="preserve">WEIGHT: </w:t>
+            </w:r>
+            <w:r>
+              <w:rPr>
+                <w:rFonts w:ascii="Times New Roman" w:cs="Times New Roman" w:eastAsia="Times New Roman" w:hAnsi="Times New Roman"/>
+                <w:b w:val="false"/>
+                <w:bCs w:val="false"/>
+                <w:sz w:val="20"/>
+                <w:szCs w:val="20"/>
+              </w:rPr>
+              <w:t xml:space="preserve">{weight}</w:t>
+            </w:r>
+          </w:p>
+          <w:p>
+            <w:pPr>
+              <w:spacing w:after="150"/>
+            </w:pPr>
+          </w:p>
+          <w:p>
+            <w:pPr>
+              <w:spacing w:after="80"/>
+              <w:jc w:val="center"/>
+            </w:pPr>
+            <w:r>
+              <w:rPr>
+                <w:rFonts w:ascii="Times New Roman" w:cs="Times New Roman" w:eastAsia="Times New Roman" w:hAnsi="Times New Roman"/>
+                <w:b/>
+                <w:bCs/>
+                <w:sz w:val="22"/>
+                <w:szCs w:val="22"/>
+              </w:rPr>
+              <w:t xml:space="preserve">EXPERIENCE</w:t>
+            </w:r>
+          </w:p>
+          <w:p>
+            <w:pPr>
+              <w:spacing w:after="80"/>
+            </w:pPr>
+            <w:r>
+              <w:rPr>
+                <w:rFonts w:ascii="Times New Roman" w:cs="Times New Roman" w:eastAsia="Times New Roman" w:hAnsi="Times New Roman"/>
+                <w:sz w:val="20"/>
+                <w:szCs w:val="20"/>
+              </w:rPr>
+              <w:t xml:space="preserve">➤ </w:t>
+            </w:r>
+            <w:r>
+              <w:rPr>
+                <w:rFonts w:ascii="Times New Roman" w:cs="Times New Roman" w:eastAsia="Times New Roman" w:hAnsi="Times New Roman"/>
+                <w:b/>
+                <w:bCs/>
+                <w:sz w:val="22"/>
+                <w:szCs w:val="22"/>
+              </w:rPr>
+              <w:t xml:space="preserve">{workPeriod}</w:t>
+            </w:r>
+          </w:p>
+          <w:p>
+            <w:pPr>
+              <w:spacing w:after="150"/>
+            </w:pPr>
+          </w:p>
+          <w:p>
+            <w:pPr>
+              <w:spacing w:after="80"/>
+              <w:jc w:val="center"/>
+            </w:pPr>
+            <w:r>
+              <w:rPr>
+                <w:rFonts w:ascii="Times New Roman" w:cs="Times New Roman" w:eastAsia="Times New Roman" w:hAnsi="Times New Roman"/>
+                <w:b/>
+                <w:bCs/>
+                <w:color w:val="0066CC"/>
+                <w:sz w:val="22"/>
+                <w:szCs w:val="22"/>
+              </w:rPr>
+              <w:t xml:space="preserve">SKILLS</w:t>
+            </w:r>
+          </w:p>
+          <w:p>
+            <w:pPr>
+              <w:jc w:val="center"/>
+            </w:pPr>
+            <w:r>
+              <w:rPr>
+                <w:rFonts w:ascii="Times New Roman" w:cs="Times New Roman" w:eastAsia="Times New Roman" w:hAnsi="Times New Roman"/>
+                <w:sz w:val="20"/>
+                <w:szCs w:val="20"/>
+              </w:rPr>
+              <w:t xml:space="preserve">{skills}</w:t>
+            </w:r>
+          </w:p>
+        </w:tc>
+      </w:tr>
+    </w:tbl>
+    <w:p>
+      <w:pPr>
+        <w:spacing w:after="100"/>
+      </w:pPr>
+    </w:p>
+    <w:tbl>
+      <w:tblPr>
+        <w:tblW w:type="pct" w:w="100%"/>
+        <w:tblBorders>
+          <w:top w:val="none" w:color="auto" w:sz="0"/>
+          <w:left w:val="none" w:color="auto" w:sz="0"/>
+          <w:bottom w:val="none" w:color="auto" w:sz="0"/>
+          <w:right w:val="none" w:color="auto" w:sz="0"/>
+          <w:insideH w:val="single" w:color="auto" w:sz="4"/>
+          <w:insideV w:val="single" w:color="auto" w:sz="4"/>
+        </w:tblBorders>
+      </w:tblPr>
+      <w:tblGrid>
+        <w:gridCol w:w="100"/>
+        <w:gridCol w:w="100"/>
+      </w:tblGrid>
+      <w:tr>
+        <w:tc>
+          <w:tcPr>
+            <w:tcW w:type="pct" w:w="25%"/>
+            <w:tcBorders>
+              <w:top w:val="none" w:color="auto" w:sz="0"/>
+              <w:left w:val="none" w:color="auto" w:sz="0"/>
+              <w:bottom w:val="none" w:color="auto" w:sz="0"/>
+              <w:right w:val="none" w:color="auto" w:sz="0"/>
+            </w:tcBorders>
+            <w:vAlign w:val="center"/>
+          </w:tcPr>
+          <w:p>
+            <w:pPr>
+              <w:jc w:val="center"/>
+            </w:pPr>
+            <w:r>
+              <w:t xml:space="preserve">{%qrCode}</w:t>
+            </w:r>
+          </w:p>
+        </w:tc>
+        <w:tc>
+          <w:tcPr>
+            <w:tcW w:type="pct" w:w="75%"/>
+            <w:tcBorders>
+              <w:top w:val="none" w:color="auto" w:sz="0"/>
+              <w:left w:val="none" w:color="auto" w:sz="0"/>
+              <w:bottom w:val="none" w:color="auto" w:sz="0"/>
+              <w:right w:val="none" w:color="auto" w:sz="0"/>
+            </w:tcBorders>
+            <w:vAlign w:val="center"/>
+          </w:tcPr>
+          <w:p>
+            <w:pPr>
+              <w:jc w:val="center"/>
+            </w:pPr>
+            <w:r>
+              <w:rPr>
+                <w:rFonts w:ascii="Times New Roman" w:cs="Times New Roman" w:eastAsia="Times New Roman" w:hAnsi="Times New Roman"/>
+                <w:b/>
+                <w:bCs/>
+                <w:color w:val="333333"/>
+                <w:sz w:val="24"/>
+                <w:szCs w:val="24"/>
+              </w:rPr>
+              <w:t xml:space="preserve">Daera Foreign Employment Agency</w:t>
+            </w:r>
+          </w:p>
+        </w:tc>
+      </w:tr>
+    </w:tbl>
     <w:sectPr>
       <w:headerReference w:type="default" r:id="rId7"/>
       <w:pgSz w:w="11906" w:h="16838" w:orient="portrait"/>
-      <w:pgMar w:top="2500" w:right="1000" w:bottom="1000" w:left="1000" w:header="708" w:footer="708" w:gutter="0"/>
+      <w:pgMar w:top="2500" w:right="750" w:bottom="600" w:left="750" w:header="708" w:footer="708" w:gutter="0"/>
       <w:pgNumType/>
       <w:docGrid w:linePitch="360"/>
     </w:sectPr>

</xml_diff>